<commit_message>
List all group members on the report cover
The TP was group work, so the Word report cover now has an
"Integrantes" block with room for several names instead of a single
student field.

Co-Authored-By: Claude Opus 5.5 <noreply@anthropic.com>
</commit_message>
<xml_diff>
--- a/docs/Informe-TP2-Prueba-de-Software.docx
+++ b/docs/Informe-TP2-Prueba-de-Software.docx
@@ -61,60 +61,115 @@
     <w:p/>
     <w:p/>
     <w:p/>
-    <w:p/>
-    <w:p/>
     <w:p>
       <w:pPr>
-        <w:spacing w:after="160"/>
-        <w:ind w:left="2268"/>
+        <w:spacing w:after="200"/>
+        <w:ind w:left="1701"/>
+      </w:pPr>
+      <w:r>
+        <w:rPr>
+          <w:b/>
+          <w:bCs/>
+          <w:sz w:val="24"/>
+          <w:szCs w:val="24"/>
+        </w:rPr>
+        <w:t xml:space="preserve">Integrantes</w:t>
+      </w:r>
+    </w:p>
+    <w:p>
+      <w:pPr>
+        <w:spacing w:after="200"/>
+        <w:ind w:left="1701"/>
         <w:jc w:val="left"/>
       </w:pPr>
       <w:r>
         <w:rPr>
-          <w:sz w:val="24"/>
-          <w:szCs w:val="24"/>
+          <w:sz w:val="22"/>
+          <w:szCs w:val="22"/>
         </w:rPr>
-        <w:t xml:space="preserve">Alumno: ________________________________</w:t>
+        <w:t xml:space="preserve">Nombre: ______________________________   Legajo: ____________</w:t>
       </w:r>
     </w:p>
     <w:p>
       <w:pPr>
-        <w:spacing w:after="160"/>
-        <w:ind w:left="2268"/>
+        <w:spacing w:after="200"/>
+        <w:ind w:left="1701"/>
         <w:jc w:val="left"/>
       </w:pPr>
       <w:r>
         <w:rPr>
-          <w:sz w:val="24"/>
-          <w:szCs w:val="24"/>
+          <w:sz w:val="22"/>
+          <w:szCs w:val="22"/>
         </w:rPr>
-        <w:t xml:space="preserve">Legajo: ________________________________</w:t>
+        <w:t xml:space="preserve">Nombre: ______________________________   Legajo: ____________</w:t>
       </w:r>
     </w:p>
     <w:p>
       <w:pPr>
-        <w:spacing w:after="160"/>
-        <w:ind w:left="2268"/>
+        <w:spacing w:after="200"/>
+        <w:ind w:left="1701"/>
         <w:jc w:val="left"/>
       </w:pPr>
       <w:r>
         <w:rPr>
-          <w:sz w:val="24"/>
-          <w:szCs w:val="24"/>
+          <w:sz w:val="22"/>
+          <w:szCs w:val="22"/>
         </w:rPr>
-        <w:t xml:space="preserve">Curso: _________________________________</w:t>
+        <w:t xml:space="preserve">Nombre: ______________________________   Legajo: ____________</w:t>
       </w:r>
     </w:p>
     <w:p>
       <w:pPr>
-        <w:spacing w:after="160"/>
-        <w:ind w:left="2268"/>
+        <w:spacing w:after="200"/>
+        <w:ind w:left="1701"/>
         <w:jc w:val="left"/>
       </w:pPr>
       <w:r>
         <w:rPr>
-          <w:sz w:val="24"/>
-          <w:szCs w:val="24"/>
+          <w:sz w:val="22"/>
+          <w:szCs w:val="22"/>
+        </w:rPr>
+        <w:t xml:space="preserve">Nombre: ______________________________   Legajo: ____________</w:t>
+      </w:r>
+    </w:p>
+    <w:p>
+      <w:pPr>
+        <w:spacing w:after="200"/>
+        <w:ind w:left="1701"/>
+        <w:jc w:val="left"/>
+      </w:pPr>
+      <w:r>
+        <w:rPr>
+          <w:sz w:val="22"/>
+          <w:szCs w:val="22"/>
+        </w:rPr>
+        <w:t xml:space="preserve"/>
+      </w:r>
+    </w:p>
+    <w:p>
+      <w:pPr>
+        <w:spacing w:after="200"/>
+        <w:ind w:left="1701"/>
+        <w:jc w:val="left"/>
+      </w:pPr>
+      <w:r>
+        <w:rPr>
+          <w:sz w:val="22"/>
+          <w:szCs w:val="22"/>
+        </w:rPr>
+        <w:t xml:space="preserve">Curso: ______________________</w:t>
+      </w:r>
+    </w:p>
+    <w:p>
+      <w:pPr>
+        <w:spacing w:after="200"/>
+        <w:ind w:left="1701"/>
+        <w:jc w:val="left"/>
+      </w:pPr>
+      <w:r>
+        <w:rPr>
+          <w:sz w:val="22"/>
+          <w:szCs w:val="22"/>
         </w:rPr>
         <w:t xml:space="preserve">Fecha: octubre de 2026</w:t>
       </w:r>

</xml_diff>